<commit_message>
Unified notifications system with clauses support and tournament deletion confirmation
</commit_message>
<xml_diff>
--- a/storage/lettere_intestate/lettera_intestata_szr6.docx
+++ b/storage/lettere_intestate/lettera_intestata_szr6.docx
@@ -961,6 +961,57 @@
     </w:p>
     <w:p>
       <w:pPr>
+        <w:rPr>
+          <w:lang w:val="it-IT"/>
+        </w:rPr>
+      </w:pPr>
+      <w:r>
+        <w:rPr>
+          <w:lang w:val="it-IT"/>
+        </w:rPr>
+        <w:t>${CLAUSOLA_SPESE}</w:t>
+      </w:r>
+    </w:p>
+    <w:p>
+      <w:pPr>
+        <w:rPr>
+          <w:lang w:val="it-IT"/>
+        </w:rPr>
+      </w:pPr>
+    </w:p>
+    <w:p>
+      <w:pPr>
+        <w:rPr>
+          <w:lang w:val="it-IT"/>
+        </w:rPr>
+      </w:pPr>
+      <w:r>
+        <w:rPr>
+          <w:lang w:val="it-IT"/>
+        </w:rPr>
+        <w:t>${CLAUSOLA_LOGISTICA}</w:t>
+      </w:r>
+    </w:p>
+    <w:p>
+      <w:pPr>
+        <w:rPr>
+          <w:lang w:val="it-IT"/>
+        </w:rPr>
+      </w:pPr>
+    </w:p>
+    <w:p>
+      <w:r>
+        <w:t>${CLAUSOLA_RESPONSABILITA}</w:t>
+      </w:r>
+    </w:p>
+    <w:p/>
+    <w:p>
+      <w:r>
+        <w:t>${CLAUSOLA_COMUNICAZIONI}</w:t>
+      </w:r>
+    </w:p>
+    <w:p>
+      <w:pPr>
         <w:ind w:left="1347" w:right="1405"/>
         <w:rPr>
           <w:iCs/>
@@ -1184,7 +1235,7 @@
         <v:path o:extrusionok="f" gradientshapeok="t" o:connecttype="rect"/>
         <o:lock v:ext="edit" aspectratio="t"/>
       </v:shapetype>
-      <v:shape id="_x0000_i1031" type="#_x0000_t75" style="width:5in;height:476pt" o:bullet="t">
+      <v:shape id="_x0000_i1131" type="#_x0000_t75" style="width:5in;height:476pt" o:bullet="t">
         <v:imagedata r:id="rId1" o:title="bullet"/>
       </v:shape>
     </w:pict>

</xml_diff>

<commit_message>
fix: standardize notification documents field and add zone filtering
</commit_message>
<xml_diff>
--- a/storage/lettere_intestate/lettera_intestata_szr6.docx
+++ b/storage/lettere_intestate/lettera_intestata_szr6.docx
@@ -961,6 +961,8 @@
     </w:p>
     <w:p>
       <w:pPr>
+        <w:ind w:left="1440"/>
+        <w:jc w:val="both"/>
         <w:rPr>
           <w:lang w:val="it-IT"/>
         </w:rPr>
@@ -974,13 +976,17 @@
     </w:p>
     <w:p>
       <w:pPr>
-        <w:rPr>
-          <w:lang w:val="it-IT"/>
-        </w:rPr>
-      </w:pPr>
-    </w:p>
-    <w:p>
-      <w:pPr>
+        <w:ind w:left="1440"/>
+        <w:jc w:val="both"/>
+        <w:rPr>
+          <w:lang w:val="it-IT"/>
+        </w:rPr>
+      </w:pPr>
+    </w:p>
+    <w:p>
+      <w:pPr>
+        <w:ind w:left="1440"/>
+        <w:jc w:val="both"/>
         <w:rPr>
           <w:lang w:val="it-IT"/>
         </w:rPr>
@@ -994,18 +1000,33 @@
     </w:p>
     <w:p>
       <w:pPr>
-        <w:rPr>
-          <w:lang w:val="it-IT"/>
-        </w:rPr>
-      </w:pPr>
-    </w:p>
-    <w:p>
+        <w:ind w:left="1440"/>
+        <w:jc w:val="both"/>
+        <w:rPr>
+          <w:lang w:val="it-IT"/>
+        </w:rPr>
+      </w:pPr>
+    </w:p>
+    <w:p>
+      <w:pPr>
+        <w:ind w:left="1440"/>
+        <w:jc w:val="both"/>
+      </w:pPr>
       <w:r>
         <w:t>${CLAUSOLA_RESPONSABILITA}</w:t>
       </w:r>
     </w:p>
-    <w:p/>
-    <w:p>
+    <w:p>
+      <w:pPr>
+        <w:ind w:left="1440"/>
+        <w:jc w:val="both"/>
+      </w:pPr>
+    </w:p>
+    <w:p>
+      <w:pPr>
+        <w:ind w:left="1440"/>
+        <w:jc w:val="both"/>
+      </w:pPr>
       <w:r>
         <w:t>${CLAUSOLA_COMUNICAZIONI}</w:t>
       </w:r>
@@ -1235,7 +1256,7 @@
         <v:path o:extrusionok="f" gradientshapeok="t" o:connecttype="rect"/>
         <o:lock v:ext="edit" aspectratio="t"/>
       </v:shapetype>
-      <v:shape id="_x0000_i1131" type="#_x0000_t75" style="width:5in;height:476pt" o:bullet="t">
+      <v:shape id="_x0000_i1184" type="#_x0000_t75" style="width:5in;height:476pt" o:bullet="t">
         <v:imagedata r:id="rId1" o:title="bullet"/>
       </v:shape>
     </w:pict>

</xml_diff>

<commit_message>
corrette le causole e szr6 ora è corretto
</commit_message>
<xml_diff>
--- a/storage/lettere_intestate/lettera_intestata_szr6.docx
+++ b/storage/lettere_intestate/lettera_intestata_szr6.docx
@@ -468,10 +468,9 @@
           <w:iCs/>
           <w:sz w:val="24"/>
           <w:szCs w:val="24"/>
-          <w:lang w:val="en-GB"/>
-        </w:rPr>
-      </w:pPr>
-      <w:proofErr w:type="spellStart"/>
+          <w:lang w:val="it-IT"/>
+        </w:rPr>
+      </w:pPr>
       <w:r>
         <w:rPr>
           <w:b/>
@@ -479,19 +478,76 @@
           <w:iCs/>
           <w:sz w:val="24"/>
           <w:szCs w:val="24"/>
-          <w:lang w:val="en-GB"/>
+          <w:lang w:val="it-IT"/>
         </w:rPr>
         <w:t>Oggetto</w:t>
       </w:r>
+      <w:r>
+        <w:rPr>
+          <w:iCs/>
+          <w:sz w:val="24"/>
+          <w:szCs w:val="24"/>
+          <w:lang w:val="it-IT"/>
+        </w:rPr>
+        <w:t>: ${</w:t>
+      </w:r>
+      <w:proofErr w:type="spellStart"/>
+      <w:r>
+        <w:rPr>
+          <w:iCs/>
+          <w:sz w:val="24"/>
+          <w:szCs w:val="24"/>
+          <w:lang w:val="it-IT"/>
+        </w:rPr>
+        <w:t>tournament_</w:t>
+      </w:r>
+      <w:proofErr w:type="gramStart"/>
+      <w:r>
+        <w:rPr>
+          <w:iCs/>
+          <w:sz w:val="24"/>
+          <w:szCs w:val="24"/>
+          <w:lang w:val="it-IT"/>
+        </w:rPr>
+        <w:t>name</w:t>
+      </w:r>
       <w:proofErr w:type="spellEnd"/>
       <w:r>
         <w:rPr>
           <w:iCs/>
           <w:sz w:val="24"/>
           <w:szCs w:val="24"/>
-          <w:lang w:val="en-GB"/>
-        </w:rPr>
-        <w:t>: ${</w:t>
+          <w:lang w:val="it-IT"/>
+        </w:rPr>
+        <w:t xml:space="preserve">} </w:t>
+      </w:r>
+      <w:r>
+        <w:rPr>
+          <w:iCs/>
+          <w:sz w:val="24"/>
+          <w:szCs w:val="24"/>
+          <w:lang w:val="it-IT"/>
+        </w:rPr>
+        <w:t xml:space="preserve"> </w:t>
+      </w:r>
+      <w:r>
+        <w:rPr>
+          <w:iCs/>
+          <w:sz w:val="24"/>
+          <w:szCs w:val="24"/>
+          <w:lang w:val="it-IT"/>
+        </w:rPr>
+        <w:t>$</w:t>
+      </w:r>
+      <w:proofErr w:type="gramEnd"/>
+      <w:r>
+        <w:rPr>
+          <w:iCs/>
+          <w:sz w:val="24"/>
+          <w:szCs w:val="24"/>
+          <w:lang w:val="it-IT"/>
+        </w:rPr>
+        <w:t>{</w:t>
       </w:r>
       <w:proofErr w:type="spellStart"/>
       <w:r>
@@ -499,19 +555,9 @@
           <w:iCs/>
           <w:sz w:val="24"/>
           <w:szCs w:val="24"/>
-          <w:lang w:val="en-GB"/>
-        </w:rPr>
-        <w:t>tournament_</w:t>
-      </w:r>
-      <w:proofErr w:type="gramStart"/>
-      <w:r>
-        <w:rPr>
-          <w:iCs/>
-          <w:sz w:val="24"/>
-          <w:szCs w:val="24"/>
-          <w:lang w:val="en-GB"/>
-        </w:rPr>
-        <w:t>name</w:t>
+          <w:lang w:val="it-IT"/>
+        </w:rPr>
+        <w:t>club_name</w:t>
       </w:r>
       <w:proofErr w:type="spellEnd"/>
       <w:r>
@@ -519,37 +565,9 @@
           <w:iCs/>
           <w:sz w:val="24"/>
           <w:szCs w:val="24"/>
-          <w:lang w:val="en-GB"/>
-        </w:rPr>
-        <w:t xml:space="preserve">} </w:t>
-      </w:r>
-      <w:r>
-        <w:rPr>
-          <w:iCs/>
-          <w:sz w:val="24"/>
-          <w:szCs w:val="24"/>
-          <w:lang w:val="en-GB"/>
-        </w:rPr>
-        <w:t xml:space="preserve"> </w:t>
-      </w:r>
-      <w:r>
-        <w:rPr>
-          <w:iCs/>
-          <w:sz w:val="24"/>
-          <w:szCs w:val="24"/>
-          <w:lang w:val="en-GB"/>
-        </w:rPr>
-        <w:t>$</w:t>
-      </w:r>
-      <w:proofErr w:type="gramEnd"/>
-      <w:r>
-        <w:rPr>
-          <w:iCs/>
-          <w:sz w:val="24"/>
-          <w:szCs w:val="24"/>
-          <w:lang w:val="en-GB"/>
-        </w:rPr>
-        <w:t>{</w:t>
+          <w:lang w:val="it-IT"/>
+        </w:rPr>
+        <w:t>} ${</w:t>
       </w:r>
       <w:proofErr w:type="spellStart"/>
       <w:r>
@@ -557,9 +575,9 @@
           <w:iCs/>
           <w:sz w:val="24"/>
           <w:szCs w:val="24"/>
-          <w:lang w:val="en-GB"/>
-        </w:rPr>
-        <w:t>club_name</w:t>
+          <w:lang w:val="it-IT"/>
+        </w:rPr>
+        <w:t>tournament_dates</w:t>
       </w:r>
       <w:proofErr w:type="spellEnd"/>
       <w:r>
@@ -567,25 +585,58 @@
           <w:iCs/>
           <w:sz w:val="24"/>
           <w:szCs w:val="24"/>
-          <w:lang w:val="en-GB"/>
+          <w:lang w:val="it-IT"/>
         </w:rPr>
         <w:t>}</w:t>
       </w:r>
-      <w:r>
-        <w:rPr>
-          <w:iCs/>
-          <w:sz w:val="24"/>
-          <w:szCs w:val="24"/>
-          <w:lang w:val="en-GB"/>
-        </w:rPr>
-        <w:t xml:space="preserve"> </w:t>
-      </w:r>
-      <w:r>
-        <w:rPr>
-          <w:iCs/>
-          <w:sz w:val="24"/>
-          <w:szCs w:val="24"/>
-          <w:lang w:val="en-GB"/>
+    </w:p>
+    <w:p>
+      <w:pPr>
+        <w:ind w:left="1347" w:right="1405"/>
+        <w:rPr>
+          <w:iCs/>
+          <w:sz w:val="24"/>
+          <w:szCs w:val="24"/>
+          <w:lang w:val="it-IT"/>
+        </w:rPr>
+      </w:pPr>
+    </w:p>
+    <w:p>
+      <w:pPr>
+        <w:ind w:right="1405"/>
+        <w:rPr>
+          <w:iCs/>
+          <w:sz w:val="24"/>
+          <w:szCs w:val="24"/>
+          <w:lang w:val="it-IT"/>
+        </w:rPr>
+      </w:pPr>
+    </w:p>
+    <w:p>
+      <w:pPr>
+        <w:ind w:left="1347" w:right="1405"/>
+        <w:rPr>
+          <w:iCs/>
+          <w:sz w:val="24"/>
+          <w:szCs w:val="24"/>
+          <w:lang w:val="it-IT"/>
+        </w:rPr>
+      </w:pPr>
+      <w:r>
+        <w:rPr>
+          <w:iCs/>
+          <w:sz w:val="24"/>
+          <w:szCs w:val="24"/>
+          <w:lang w:val="it-IT"/>
+        </w:rPr>
+        <w:t xml:space="preserve">Data: </w:t>
+      </w:r>
+      <w:r>
+        <w:rPr>
+          <w:iCs/>
+          <w:sz w:val="24"/>
+          <w:szCs w:val="24"/>
+          <w:lang w:val="it-IT"/>
         </w:rPr>
         <w:t>${</w:t>
       </w:r>
@@ -595,80 +646,11 @@
           <w:iCs/>
           <w:sz w:val="24"/>
           <w:szCs w:val="24"/>
-          <w:lang w:val="en-GB"/>
-        </w:rPr>
-        <w:t>tournament_dates</w:t>
+          <w:lang w:val="it-IT"/>
+        </w:rPr>
+        <w:t>current_date</w:t>
       </w:r>
       <w:proofErr w:type="spellEnd"/>
-      <w:r>
-        <w:rPr>
-          <w:iCs/>
-          <w:sz w:val="24"/>
-          <w:szCs w:val="24"/>
-          <w:lang w:val="en-GB"/>
-        </w:rPr>
-        <w:t>}</w:t>
-      </w:r>
-    </w:p>
-    <w:p>
-      <w:pPr>
-        <w:ind w:left="1347" w:right="1405"/>
-        <w:rPr>
-          <w:iCs/>
-          <w:sz w:val="24"/>
-          <w:szCs w:val="24"/>
-          <w:lang w:val="en-GB"/>
-        </w:rPr>
-      </w:pPr>
-    </w:p>
-    <w:p>
-      <w:pPr>
-        <w:ind w:right="1405"/>
-        <w:rPr>
-          <w:iCs/>
-          <w:sz w:val="24"/>
-          <w:szCs w:val="24"/>
-          <w:lang w:val="en-GB"/>
-        </w:rPr>
-      </w:pPr>
-    </w:p>
-    <w:p>
-      <w:pPr>
-        <w:ind w:left="1347" w:right="1405"/>
-        <w:rPr>
-          <w:iCs/>
-          <w:sz w:val="24"/>
-          <w:szCs w:val="24"/>
-          <w:lang w:val="it-IT"/>
-        </w:rPr>
-      </w:pPr>
-      <w:r>
-        <w:rPr>
-          <w:iCs/>
-          <w:sz w:val="24"/>
-          <w:szCs w:val="24"/>
-          <w:lang w:val="it-IT"/>
-        </w:rPr>
-        <w:t xml:space="preserve">Data: </w:t>
-      </w:r>
-      <w:r>
-        <w:rPr>
-          <w:iCs/>
-          <w:sz w:val="24"/>
-          <w:szCs w:val="24"/>
-          <w:lang w:val="it-IT"/>
-        </w:rPr>
-        <w:t>${</w:t>
-      </w:r>
-      <w:r>
-        <w:rPr>
-          <w:iCs/>
-          <w:sz w:val="24"/>
-          <w:szCs w:val="24"/>
-          <w:lang w:val="it-IT"/>
-        </w:rPr>
-        <w:t>current_date</w:t>
-      </w:r>
       <w:r>
         <w:rPr>
           <w:iCs/>
@@ -971,7 +953,31 @@
         <w:rPr>
           <w:lang w:val="it-IT"/>
         </w:rPr>
-        <w:t>${CLAUSOLA_SPESE}</w:t>
+        <w:t>${</w:t>
+      </w:r>
+      <w:r>
+        <w:rPr>
+          <w:lang w:val="it-IT"/>
+        </w:rPr>
+        <w:t>BLOCCO_</w:t>
+      </w:r>
+      <w:r>
+        <w:rPr>
+          <w:lang w:val="it-IT"/>
+        </w:rPr>
+        <w:t>CLAUSOLA_</w:t>
+      </w:r>
+      <w:r>
+        <w:rPr>
+          <w:lang w:val="it-IT"/>
+        </w:rPr>
+        <w:t>CLUB_</w:t>
+      </w:r>
+      <w:r>
+        <w:rPr>
+          <w:lang w:val="it-IT"/>
+        </w:rPr>
+        <w:t>SPESE}</w:t>
       </w:r>
     </w:p>
     <w:p>
@@ -982,6 +988,36 @@
           <w:lang w:val="it-IT"/>
         </w:rPr>
       </w:pPr>
+      <w:r>
+        <w:rPr>
+          <w:lang w:val="it-IT"/>
+        </w:rPr>
+        <w:t>${CLAUSOLA</w:t>
+      </w:r>
+      <w:r>
+        <w:rPr>
+          <w:lang w:val="it-IT"/>
+        </w:rPr>
+        <w:t>_</w:t>
+      </w:r>
+      <w:r>
+        <w:rPr>
+          <w:lang w:val="it-IT"/>
+        </w:rPr>
+        <w:t>CLUB</w:t>
+      </w:r>
+      <w:r>
+        <w:rPr>
+          <w:lang w:val="it-IT"/>
+        </w:rPr>
+        <w:t xml:space="preserve"> </w:t>
+      </w:r>
+      <w:r>
+        <w:rPr>
+          <w:lang w:val="it-IT"/>
+        </w:rPr>
+        <w:t>_SPESE}</w:t>
+      </w:r>
     </w:p>
     <w:p>
       <w:pPr>
@@ -995,7 +1031,49 @@
         <w:rPr>
           <w:lang w:val="it-IT"/>
         </w:rPr>
-        <w:t>${CLAUSOLA_LOGISTICA}</w:t>
+        <w:t>${</w:t>
+      </w:r>
+      <w:r>
+        <w:rPr>
+          <w:lang w:val="it-IT"/>
+        </w:rPr>
+        <w:t>/</w:t>
+      </w:r>
+      <w:r>
+        <w:rPr>
+          <w:lang w:val="it-IT"/>
+        </w:rPr>
+        <w:t>BLOCCO_</w:t>
+      </w:r>
+      <w:r>
+        <w:rPr>
+          <w:lang w:val="it-IT"/>
+        </w:rPr>
+        <w:t>CLAUSOLA</w:t>
+      </w:r>
+      <w:r>
+        <w:rPr>
+          <w:lang w:val="it-IT"/>
+        </w:rPr>
+        <w:t>_</w:t>
+      </w:r>
+      <w:r>
+        <w:rPr>
+          <w:lang w:val="it-IT"/>
+        </w:rPr>
+        <w:t>CLUB</w:t>
+      </w:r>
+      <w:r>
+        <w:rPr>
+          <w:lang w:val="it-IT"/>
+        </w:rPr>
+        <w:t xml:space="preserve"> </w:t>
+      </w:r>
+      <w:r>
+        <w:rPr>
+          <w:lang w:val="it-IT"/>
+        </w:rPr>
+        <w:t>_SPESE}</w:t>
       </w:r>
     </w:p>
     <w:p>
@@ -1011,24 +1089,180 @@
       <w:pPr>
         <w:ind w:left="1440"/>
         <w:jc w:val="both"/>
-      </w:pPr>
-      <w:r>
-        <w:t>${CLAUSOLA_RESPONSABILITA}</w:t>
+        <w:rPr>
+          <w:lang w:val="it-IT"/>
+        </w:rPr>
+      </w:pPr>
+      <w:r>
+        <w:rPr>
+          <w:lang w:val="it-IT"/>
+        </w:rPr>
+        <w:t>${</w:t>
+      </w:r>
+      <w:r>
+        <w:rPr>
+          <w:lang w:val="it-IT"/>
+        </w:rPr>
+        <w:t>BLOCCO_</w:t>
+      </w:r>
+      <w:r>
+        <w:rPr>
+          <w:lang w:val="it-IT"/>
+        </w:rPr>
+        <w:t>CLAUSOLA_LOGISTICA}</w:t>
       </w:r>
     </w:p>
     <w:p>
       <w:pPr>
         <w:ind w:left="1440"/>
         <w:jc w:val="both"/>
-      </w:pPr>
+        <w:rPr>
+          <w:lang w:val="it-IT"/>
+        </w:rPr>
+      </w:pPr>
+      <w:r>
+        <w:rPr>
+          <w:lang w:val="it-IT"/>
+        </w:rPr>
+        <w:t>${CLAUSOLA_LOGISTICA}</w:t>
+      </w:r>
     </w:p>
     <w:p>
       <w:pPr>
         <w:ind w:left="1440"/>
         <w:jc w:val="both"/>
+        <w:rPr>
+          <w:lang w:val="it-IT"/>
+        </w:rPr>
+      </w:pPr>
+      <w:r>
+        <w:rPr>
+          <w:lang w:val="it-IT"/>
+        </w:rPr>
+        <w:t>${</w:t>
+      </w:r>
+      <w:r>
+        <w:rPr>
+          <w:lang w:val="it-IT"/>
+        </w:rPr>
+        <w:t>/BLOCCO_</w:t>
+      </w:r>
+      <w:r>
+        <w:rPr>
+          <w:lang w:val="it-IT"/>
+        </w:rPr>
+        <w:t>CLAUSOLA_LOGISTICA}</w:t>
+      </w:r>
+    </w:p>
+    <w:p>
+      <w:pPr>
+        <w:ind w:left="1440"/>
+        <w:jc w:val="both"/>
+        <w:rPr>
+          <w:lang w:val="it-IT"/>
+        </w:rPr>
+      </w:pPr>
+    </w:p>
+    <w:p>
+      <w:pPr>
+        <w:ind w:left="1440"/>
+        <w:jc w:val="both"/>
+      </w:pPr>
+      <w:r>
+        <w:t>${</w:t>
+      </w:r>
+      <w:r>
+        <w:rPr>
+          <w:lang w:val="it-IT"/>
+        </w:rPr>
+        <w:t>BLOCCO_</w:t>
+      </w:r>
+      <w:r>
+        <w:t>CLAUSOLA_RESPONSABILITA}</w:t>
+      </w:r>
+    </w:p>
+    <w:p>
+      <w:pPr>
+        <w:ind w:left="1440"/>
+        <w:jc w:val="both"/>
+      </w:pPr>
+      <w:r>
+        <w:t>${CLAUSOLA_RESPONSABILITA}</w:t>
+      </w:r>
+    </w:p>
+    <w:p>
+      <w:pPr>
+        <w:ind w:left="1440"/>
+        <w:jc w:val="both"/>
+      </w:pPr>
+      <w:r>
+        <w:rPr>
+          <w:lang w:val="it-IT"/>
+        </w:rPr>
+        <w:t>${</w:t>
+      </w:r>
+      <w:r>
+        <w:rPr>
+          <w:lang w:val="it-IT"/>
+        </w:rPr>
+        <w:t>/BLOCCO_</w:t>
+      </w:r>
+      <w:r>
+        <w:t>CLAUSOLA_RESPONSABILITA}</w:t>
+      </w:r>
+    </w:p>
+    <w:p>
+      <w:pPr>
+        <w:ind w:left="1440"/>
+        <w:jc w:val="both"/>
+      </w:pPr>
+    </w:p>
+    <w:p>
+      <w:pPr>
+        <w:ind w:left="1440"/>
+        <w:jc w:val="both"/>
+      </w:pPr>
+      <w:r>
+        <w:t>${</w:t>
+      </w:r>
+      <w:r>
+        <w:rPr>
+          <w:lang w:val="it-IT"/>
+        </w:rPr>
+        <w:t>BLOCCO_</w:t>
+      </w:r>
+      <w:r>
+        <w:t>CLAUSOLA_COMUNICAZIONI}</w:t>
+      </w:r>
+    </w:p>
+    <w:p>
+      <w:pPr>
+        <w:ind w:left="1440"/>
+        <w:jc w:val="both"/>
       </w:pPr>
       <w:r>
         <w:t>${CLAUSOLA_COMUNICAZIONI}</w:t>
+      </w:r>
+    </w:p>
+    <w:p>
+      <w:pPr>
+        <w:ind w:left="1440"/>
+        <w:jc w:val="both"/>
+      </w:pPr>
+      <w:r>
+        <w:rPr>
+          <w:lang w:val="it-IT"/>
+        </w:rPr>
+        <w:t>${</w:t>
+      </w:r>
+      <w:r>
+        <w:rPr>
+          <w:lang w:val="it-IT"/>
+        </w:rPr>
+        <w:t>/BLOCCO_</w:t>
+      </w:r>
+      <w:r>
+        <w:t>CLAUSOLA_COMUNICAZIONI}</w:t>
       </w:r>
     </w:p>
     <w:p>
@@ -1256,7 +1490,7 @@
         <v:path o:extrusionok="f" gradientshapeok="t" o:connecttype="rect"/>
         <o:lock v:ext="edit" aspectratio="t"/>
       </v:shapetype>
-      <v:shape id="_x0000_i1184" type="#_x0000_t75" style="width:5in;height:476pt" o:bullet="t">
+      <v:shape id="_x0000_i1025" type="#_x0000_t75" style="width:5in;height:476pt" o:bullet="t">
         <v:imagedata r:id="rId1" o:title="bullet"/>
       </v:shape>
     </w:pict>

</xml_diff>

<commit_message>
Fix document regeneration with clauses
</commit_message>
<xml_diff>
--- a/storage/lettere_intestate/lettera_intestata_szr6.docx
+++ b/storage/lettere_intestate/lettera_intestata_szr6.docx
@@ -943,326 +943,422 @@
     </w:p>
     <w:p>
       <w:pPr>
-        <w:ind w:left="1440"/>
+        <w:ind w:left="1347" w:right="1405"/>
         <w:jc w:val="both"/>
         <w:rPr>
-          <w:lang w:val="it-IT"/>
-        </w:rPr>
-      </w:pPr>
-      <w:r>
-        <w:rPr>
+          <w:sz w:val="24"/>
+          <w:szCs w:val="24"/>
+          <w:lang w:val="it-IT"/>
+        </w:rPr>
+      </w:pPr>
+      <w:r>
+        <w:rPr>
+          <w:sz w:val="24"/>
+          <w:szCs w:val="24"/>
+          <w:lang w:val="it-IT"/>
+        </w:rPr>
+        <w:t>${BLOCCO_CLAUSOLA_</w:t>
+      </w:r>
+      <w:r>
+        <w:rPr>
+          <w:sz w:val="24"/>
+          <w:szCs w:val="24"/>
+          <w:lang w:val="it-IT"/>
+        </w:rPr>
+        <w:t>CLUB_</w:t>
+      </w:r>
+      <w:r>
+        <w:rPr>
+          <w:sz w:val="24"/>
+          <w:szCs w:val="24"/>
+          <w:lang w:val="it-IT"/>
+        </w:rPr>
+        <w:t>SPESE}</w:t>
+      </w:r>
+    </w:p>
+    <w:p>
+      <w:pPr>
+        <w:ind w:left="1347" w:right="1405"/>
+        <w:jc w:val="both"/>
+        <w:rPr>
+          <w:sz w:val="24"/>
+          <w:szCs w:val="24"/>
+          <w:lang w:val="it-IT"/>
+        </w:rPr>
+      </w:pPr>
+      <w:r>
+        <w:rPr>
+          <w:sz w:val="24"/>
+          <w:szCs w:val="24"/>
+          <w:lang w:val="it-IT"/>
+        </w:rPr>
+        <w:t>${CLAUSOLA</w:t>
+      </w:r>
+      <w:r>
+        <w:rPr>
+          <w:sz w:val="24"/>
+          <w:szCs w:val="24"/>
+          <w:lang w:val="it-IT"/>
+        </w:rPr>
+        <w:t>_CLUB</w:t>
+      </w:r>
+      <w:r>
+        <w:rPr>
+          <w:sz w:val="24"/>
+          <w:szCs w:val="24"/>
+          <w:lang w:val="it-IT"/>
+        </w:rPr>
+        <w:t>_SPESE}</w:t>
+      </w:r>
+    </w:p>
+    <w:p>
+      <w:pPr>
+        <w:ind w:left="1347" w:right="1405"/>
+        <w:jc w:val="both"/>
+        <w:rPr>
+          <w:sz w:val="24"/>
+          <w:szCs w:val="24"/>
+          <w:lang w:val="it-IT"/>
+        </w:rPr>
+      </w:pPr>
+      <w:r>
+        <w:rPr>
+          <w:sz w:val="24"/>
+          <w:szCs w:val="24"/>
+          <w:lang w:val="it-IT"/>
+        </w:rPr>
+        <w:t>${/BLOCCO_CLAUSOLA</w:t>
+      </w:r>
+      <w:r>
+        <w:rPr>
+          <w:sz w:val="24"/>
+          <w:szCs w:val="24"/>
+          <w:lang w:val="it-IT"/>
+        </w:rPr>
+        <w:t>_CLUB</w:t>
+      </w:r>
+      <w:r>
+        <w:rPr>
+          <w:sz w:val="24"/>
+          <w:szCs w:val="24"/>
+          <w:lang w:val="it-IT"/>
+        </w:rPr>
+        <w:t>_SPESE}</w:t>
+      </w:r>
+    </w:p>
+    <w:p>
+      <w:pPr>
+        <w:ind w:left="1347" w:right="1405"/>
+        <w:jc w:val="both"/>
+        <w:rPr>
+          <w:sz w:val="24"/>
+          <w:szCs w:val="24"/>
+          <w:lang w:val="it-IT"/>
+        </w:rPr>
+      </w:pPr>
+      <w:r>
+        <w:rPr>
+          <w:sz w:val="24"/>
+          <w:szCs w:val="24"/>
+          <w:lang w:val="it-IT"/>
+        </w:rPr>
+        <w:t>${BLOCCO_</w:t>
+      </w:r>
+      <w:r>
+        <w:rPr>
+          <w:sz w:val="24"/>
+          <w:szCs w:val="24"/>
+          <w:lang w:val="it-IT"/>
+        </w:rPr>
+        <w:t>CLAUSOLA_CLUB_LOGISTICA</w:t>
+      </w:r>
+      <w:r>
+        <w:rPr>
+          <w:sz w:val="24"/>
+          <w:szCs w:val="24"/>
+          <w:lang w:val="it-IT"/>
+        </w:rPr>
+        <w:t>}</w:t>
+      </w:r>
+    </w:p>
+    <w:p>
+      <w:pPr>
+        <w:ind w:left="1347" w:right="1405"/>
+        <w:jc w:val="both"/>
+        <w:rPr>
+          <w:sz w:val="24"/>
+          <w:szCs w:val="24"/>
+          <w:lang w:val="it-IT"/>
+        </w:rPr>
+      </w:pPr>
+      <w:r>
+        <w:rPr>
+          <w:sz w:val="24"/>
+          <w:szCs w:val="24"/>
           <w:lang w:val="it-IT"/>
         </w:rPr>
         <w:t>${</w:t>
       </w:r>
       <w:r>
         <w:rPr>
-          <w:lang w:val="it-IT"/>
-        </w:rPr>
-        <w:t>BLOCCO_</w:t>
-      </w:r>
-      <w:r>
-        <w:rPr>
-          <w:lang w:val="it-IT"/>
-        </w:rPr>
-        <w:t>CLAUSOLA_</w:t>
-      </w:r>
-      <w:r>
-        <w:rPr>
-          <w:lang w:val="it-IT"/>
-        </w:rPr>
-        <w:t>CLUB_</w:t>
-      </w:r>
-      <w:r>
-        <w:rPr>
-          <w:lang w:val="it-IT"/>
-        </w:rPr>
-        <w:t>SPESE}</w:t>
-      </w:r>
-    </w:p>
-    <w:p>
-      <w:pPr>
-        <w:ind w:left="1440"/>
+          <w:sz w:val="24"/>
+          <w:szCs w:val="24"/>
+          <w:lang w:val="it-IT"/>
+        </w:rPr>
+        <w:t>CLAUSOLA_CLUB_LOGISTICA</w:t>
+      </w:r>
+      <w:r>
+        <w:rPr>
+          <w:sz w:val="24"/>
+          <w:szCs w:val="24"/>
+          <w:lang w:val="it-IT"/>
+        </w:rPr>
+        <w:t>}</w:t>
+      </w:r>
+    </w:p>
+    <w:p>
+      <w:pPr>
+        <w:ind w:left="1347" w:right="1405"/>
         <w:jc w:val="both"/>
         <w:rPr>
-          <w:lang w:val="it-IT"/>
-        </w:rPr>
-      </w:pPr>
-      <w:r>
-        <w:rPr>
-          <w:lang w:val="it-IT"/>
-        </w:rPr>
-        <w:t>${CLAUSOLA</w:t>
-      </w:r>
-      <w:r>
-        <w:rPr>
-          <w:lang w:val="it-IT"/>
-        </w:rPr>
-        <w:t>_</w:t>
-      </w:r>
-      <w:r>
-        <w:rPr>
-          <w:lang w:val="it-IT"/>
-        </w:rPr>
-        <w:t>CLUB</w:t>
-      </w:r>
-      <w:r>
-        <w:rPr>
-          <w:lang w:val="it-IT"/>
-        </w:rPr>
-        <w:t xml:space="preserve"> </w:t>
-      </w:r>
-      <w:r>
-        <w:rPr>
-          <w:lang w:val="it-IT"/>
-        </w:rPr>
-        <w:t>_SPESE}</w:t>
-      </w:r>
-    </w:p>
-    <w:p>
-      <w:pPr>
-        <w:ind w:left="1440"/>
+          <w:sz w:val="24"/>
+          <w:szCs w:val="24"/>
+          <w:lang w:val="it-IT"/>
+        </w:rPr>
+      </w:pPr>
+      <w:r>
+        <w:rPr>
+          <w:sz w:val="24"/>
+          <w:szCs w:val="24"/>
+          <w:lang w:val="it-IT"/>
+        </w:rPr>
+        <w:t>${/BLOCCO_</w:t>
+      </w:r>
+      <w:r>
+        <w:rPr>
+          <w:sz w:val="24"/>
+          <w:szCs w:val="24"/>
+          <w:lang w:val="it-IT"/>
+        </w:rPr>
+        <w:t>CLAUSOLA_CLUB_LOGISTICA</w:t>
+      </w:r>
+      <w:r>
+        <w:rPr>
+          <w:sz w:val="24"/>
+          <w:szCs w:val="24"/>
+          <w:lang w:val="it-IT"/>
+        </w:rPr>
+        <w:t>}</w:t>
+      </w:r>
+    </w:p>
+    <w:p>
+      <w:pPr>
+        <w:ind w:left="1347" w:right="1405"/>
         <w:jc w:val="both"/>
         <w:rPr>
-          <w:lang w:val="it-IT"/>
-        </w:rPr>
-      </w:pPr>
-      <w:r>
-        <w:rPr>
+          <w:sz w:val="24"/>
+          <w:szCs w:val="24"/>
+          <w:lang w:val="it-IT"/>
+        </w:rPr>
+      </w:pPr>
+      <w:r>
+        <w:rPr>
+          <w:sz w:val="24"/>
+          <w:szCs w:val="24"/>
+          <w:lang w:val="it-IT"/>
+        </w:rPr>
+        <w:t>${BLOCCO_</w:t>
+      </w:r>
+      <w:r>
+        <w:rPr>
+          <w:sz w:val="24"/>
+          <w:szCs w:val="24"/>
+          <w:lang w:val="it-IT"/>
+        </w:rPr>
+        <w:t>CLAUSOLA_ARBITRO_RESPONSABILITA</w:t>
+      </w:r>
+      <w:r>
+        <w:rPr>
+          <w:sz w:val="24"/>
+          <w:szCs w:val="24"/>
+          <w:lang w:val="it-IT"/>
+        </w:rPr>
+        <w:t>}</w:t>
+      </w:r>
+    </w:p>
+    <w:p>
+      <w:pPr>
+        <w:ind w:left="1347" w:right="1405"/>
+        <w:jc w:val="both"/>
+        <w:rPr>
+          <w:sz w:val="24"/>
+          <w:szCs w:val="24"/>
+          <w:lang w:val="it-IT"/>
+        </w:rPr>
+      </w:pPr>
+      <w:r>
+        <w:rPr>
+          <w:sz w:val="24"/>
+          <w:szCs w:val="24"/>
           <w:lang w:val="it-IT"/>
         </w:rPr>
         <w:t>${</w:t>
       </w:r>
       <w:r>
         <w:rPr>
-          <w:lang w:val="it-IT"/>
-        </w:rPr>
-        <w:t>/</w:t>
-      </w:r>
-      <w:r>
-        <w:rPr>
-          <w:lang w:val="it-IT"/>
-        </w:rPr>
-        <w:t>BLOCCO_</w:t>
-      </w:r>
-      <w:r>
-        <w:rPr>
-          <w:lang w:val="it-IT"/>
-        </w:rPr>
-        <w:t>CLAUSOLA</w:t>
-      </w:r>
-      <w:r>
-        <w:rPr>
-          <w:lang w:val="it-IT"/>
-        </w:rPr>
-        <w:t>_</w:t>
-      </w:r>
-      <w:r>
-        <w:rPr>
-          <w:lang w:val="it-IT"/>
-        </w:rPr>
-        <w:t>CLUB</w:t>
-      </w:r>
-      <w:r>
-        <w:rPr>
-          <w:lang w:val="it-IT"/>
-        </w:rPr>
-        <w:t xml:space="preserve"> </w:t>
-      </w:r>
-      <w:r>
-        <w:rPr>
-          <w:lang w:val="it-IT"/>
-        </w:rPr>
-        <w:t>_SPESE}</w:t>
-      </w:r>
-    </w:p>
-    <w:p>
-      <w:pPr>
-        <w:ind w:left="1440"/>
+          <w:sz w:val="24"/>
+          <w:szCs w:val="24"/>
+          <w:lang w:val="it-IT"/>
+        </w:rPr>
+        <w:t>CLAUSOLA_ARBITRO_RESPONSABILITA</w:t>
+      </w:r>
+      <w:r>
+        <w:rPr>
+          <w:sz w:val="24"/>
+          <w:szCs w:val="24"/>
+          <w:lang w:val="it-IT"/>
+        </w:rPr>
+        <w:t>}</w:t>
+      </w:r>
+    </w:p>
+    <w:p>
+      <w:pPr>
+        <w:ind w:left="1347" w:right="1405"/>
         <w:jc w:val="both"/>
         <w:rPr>
-          <w:lang w:val="it-IT"/>
-        </w:rPr>
-      </w:pPr>
-    </w:p>
-    <w:p>
-      <w:pPr>
-        <w:ind w:left="1440"/>
+          <w:sz w:val="24"/>
+          <w:szCs w:val="24"/>
+          <w:lang w:val="it-IT"/>
+        </w:rPr>
+      </w:pPr>
+      <w:r>
+        <w:rPr>
+          <w:sz w:val="24"/>
+          <w:szCs w:val="24"/>
+          <w:lang w:val="it-IT"/>
+        </w:rPr>
+        <w:t>${/BLOCCO_</w:t>
+      </w:r>
+      <w:r>
+        <w:rPr>
+          <w:sz w:val="24"/>
+          <w:szCs w:val="24"/>
+          <w:lang w:val="it-IT"/>
+        </w:rPr>
+        <w:t>CLAUSOLA_ARBITRO_RESPONSABILITA</w:t>
+      </w:r>
+      <w:r>
+        <w:rPr>
+          <w:sz w:val="24"/>
+          <w:szCs w:val="24"/>
+          <w:lang w:val="it-IT"/>
+        </w:rPr>
+        <w:t>}</w:t>
+      </w:r>
+    </w:p>
+    <w:p>
+      <w:pPr>
+        <w:ind w:left="1347" w:right="1405"/>
         <w:jc w:val="both"/>
         <w:rPr>
-          <w:lang w:val="it-IT"/>
-        </w:rPr>
-      </w:pPr>
-      <w:r>
-        <w:rPr>
+          <w:sz w:val="24"/>
+          <w:szCs w:val="24"/>
+          <w:lang w:val="it-IT"/>
+        </w:rPr>
+      </w:pPr>
+      <w:r>
+        <w:rPr>
+          <w:sz w:val="24"/>
+          <w:szCs w:val="24"/>
+          <w:lang w:val="it-IT"/>
+        </w:rPr>
+        <w:t>${BLOCCO_</w:t>
+      </w:r>
+      <w:r>
+        <w:rPr>
+          <w:sz w:val="24"/>
+          <w:szCs w:val="24"/>
+          <w:lang w:val="it-IT"/>
+        </w:rPr>
+        <w:t>CLAUSOLA_ARBITRO_COMUNICAZIONI</w:t>
+      </w:r>
+      <w:r>
+        <w:rPr>
+          <w:sz w:val="24"/>
+          <w:szCs w:val="24"/>
+          <w:lang w:val="it-IT"/>
+        </w:rPr>
+        <w:t>}</w:t>
+      </w:r>
+    </w:p>
+    <w:p>
+      <w:pPr>
+        <w:ind w:left="1347" w:right="1405"/>
+        <w:jc w:val="both"/>
+        <w:rPr>
+          <w:sz w:val="24"/>
+          <w:szCs w:val="24"/>
+          <w:lang w:val="it-IT"/>
+        </w:rPr>
+      </w:pPr>
+      <w:r>
+        <w:rPr>
+          <w:sz w:val="24"/>
+          <w:szCs w:val="24"/>
           <w:lang w:val="it-IT"/>
         </w:rPr>
         <w:t>${</w:t>
       </w:r>
       <w:r>
         <w:rPr>
-          <w:lang w:val="it-IT"/>
-        </w:rPr>
-        <w:t>BLOCCO_</w:t>
-      </w:r>
-      <w:r>
-        <w:rPr>
-          <w:lang w:val="it-IT"/>
-        </w:rPr>
-        <w:t>CLAUSOLA_LOGISTICA}</w:t>
-      </w:r>
-    </w:p>
-    <w:p>
-      <w:pPr>
-        <w:ind w:left="1440"/>
+          <w:sz w:val="24"/>
+          <w:szCs w:val="24"/>
+          <w:lang w:val="it-IT"/>
+        </w:rPr>
+        <w:t>CLAUSOLA_ARBITRO_COMUNICAZIONI</w:t>
+      </w:r>
+      <w:r>
+        <w:rPr>
+          <w:sz w:val="24"/>
+          <w:szCs w:val="24"/>
+          <w:lang w:val="it-IT"/>
+        </w:rPr>
+        <w:t>}</w:t>
+      </w:r>
+    </w:p>
+    <w:p>
+      <w:pPr>
+        <w:ind w:left="1347" w:right="1405"/>
         <w:jc w:val="both"/>
         <w:rPr>
-          <w:lang w:val="it-IT"/>
-        </w:rPr>
-      </w:pPr>
-      <w:r>
-        <w:rPr>
-          <w:lang w:val="it-IT"/>
-        </w:rPr>
-        <w:t>${CLAUSOLA_LOGISTICA}</w:t>
-      </w:r>
-    </w:p>
-    <w:p>
-      <w:pPr>
-        <w:ind w:left="1440"/>
-        <w:jc w:val="both"/>
-        <w:rPr>
-          <w:lang w:val="it-IT"/>
-        </w:rPr>
-      </w:pPr>
-      <w:r>
-        <w:rPr>
-          <w:lang w:val="it-IT"/>
-        </w:rPr>
-        <w:t>${</w:t>
-      </w:r>
-      <w:r>
-        <w:rPr>
-          <w:lang w:val="it-IT"/>
-        </w:rPr>
-        <w:t>/BLOCCO_</w:t>
-      </w:r>
-      <w:r>
-        <w:rPr>
-          <w:lang w:val="it-IT"/>
-        </w:rPr>
-        <w:t>CLAUSOLA_LOGISTICA}</w:t>
-      </w:r>
-    </w:p>
-    <w:p>
-      <w:pPr>
-        <w:ind w:left="1440"/>
-        <w:jc w:val="both"/>
-        <w:rPr>
-          <w:lang w:val="it-IT"/>
-        </w:rPr>
-      </w:pPr>
-    </w:p>
-    <w:p>
-      <w:pPr>
-        <w:ind w:left="1440"/>
-        <w:jc w:val="both"/>
-      </w:pPr>
-      <w:r>
-        <w:t>${</w:t>
-      </w:r>
-      <w:r>
-        <w:rPr>
-          <w:lang w:val="it-IT"/>
-        </w:rPr>
-        <w:t>BLOCCO_</w:t>
-      </w:r>
-      <w:r>
-        <w:t>CLAUSOLA_RESPONSABILITA}</w:t>
-      </w:r>
-    </w:p>
-    <w:p>
-      <w:pPr>
-        <w:ind w:left="1440"/>
-        <w:jc w:val="both"/>
-      </w:pPr>
-      <w:r>
-        <w:t>${CLAUSOLA_RESPONSABILITA}</w:t>
-      </w:r>
-    </w:p>
-    <w:p>
-      <w:pPr>
-        <w:ind w:left="1440"/>
-        <w:jc w:val="both"/>
-      </w:pPr>
-      <w:r>
-        <w:rPr>
-          <w:lang w:val="it-IT"/>
-        </w:rPr>
-        <w:t>${</w:t>
-      </w:r>
-      <w:r>
-        <w:rPr>
-          <w:lang w:val="it-IT"/>
-        </w:rPr>
-        <w:t>/BLOCCO_</w:t>
-      </w:r>
-      <w:r>
-        <w:t>CLAUSOLA_RESPONSABILITA}</w:t>
-      </w:r>
-    </w:p>
-    <w:p>
-      <w:pPr>
-        <w:ind w:left="1440"/>
-        <w:jc w:val="both"/>
-      </w:pPr>
-    </w:p>
-    <w:p>
-      <w:pPr>
-        <w:ind w:left="1440"/>
-        <w:jc w:val="both"/>
-      </w:pPr>
-      <w:r>
-        <w:t>${</w:t>
-      </w:r>
-      <w:r>
-        <w:rPr>
-          <w:lang w:val="it-IT"/>
-        </w:rPr>
-        <w:t>BLOCCO_</w:t>
-      </w:r>
-      <w:r>
-        <w:t>CLAUSOLA_COMUNICAZIONI}</w:t>
-      </w:r>
-    </w:p>
-    <w:p>
-      <w:pPr>
-        <w:ind w:left="1440"/>
-        <w:jc w:val="both"/>
-      </w:pPr>
-      <w:r>
-        <w:t>${CLAUSOLA_COMUNICAZIONI}</w:t>
-      </w:r>
-    </w:p>
-    <w:p>
-      <w:pPr>
-        <w:ind w:left="1440"/>
-        <w:jc w:val="both"/>
-      </w:pPr>
-      <w:r>
-        <w:rPr>
-          <w:lang w:val="it-IT"/>
-        </w:rPr>
-        <w:t>${</w:t>
-      </w:r>
-      <w:r>
-        <w:rPr>
-          <w:lang w:val="it-IT"/>
-        </w:rPr>
-        <w:t>/BLOCCO_</w:t>
-      </w:r>
-      <w:r>
-        <w:t>CLAUSOLA_COMUNICAZIONI}</w:t>
+          <w:sz w:val="24"/>
+          <w:szCs w:val="24"/>
+          <w:lang w:val="it-IT"/>
+        </w:rPr>
+      </w:pPr>
+      <w:r>
+        <w:rPr>
+          <w:sz w:val="24"/>
+          <w:szCs w:val="24"/>
+          <w:lang w:val="it-IT"/>
+        </w:rPr>
+        <w:t>${/BLOCCO_</w:t>
+      </w:r>
+      <w:r>
+        <w:rPr>
+          <w:sz w:val="24"/>
+          <w:szCs w:val="24"/>
+          <w:lang w:val="it-IT"/>
+        </w:rPr>
+        <w:t>CLAUSOLA_ARBITRO_COMUNICAZIONI</w:t>
+      </w:r>
+      <w:r>
+        <w:rPr>
+          <w:sz w:val="24"/>
+          <w:szCs w:val="24"/>
+          <w:lang w:val="it-IT"/>
+        </w:rPr>
+        <w:t>}</w:t>
       </w:r>
     </w:p>
     <w:p>

</xml_diff>